<commit_message>
tis 4lr and rkis started 3 lr
</commit_message>
<xml_diff>
--- a/pidis/Алимбеков дкип-481 лр2.docx
+++ b/pidis/Алимбеков дкип-481 лр2.docx
@@ -705,6 +705,7 @@
           <w:color w:val="000000"/>
           <w:sz w:val="28"/>
           <w:szCs w:val="28"/>
+          <w:lang w:val="en-US"/>
         </w:rPr>
       </w:pPr>
       <w:r>
@@ -744,7 +745,18 @@
           <w:sz w:val="28"/>
           <w:szCs w:val="28"/>
         </w:rPr>
-        <w:t xml:space="preserve"> 1</w:t>
+        <w:t xml:space="preserve"> </w:t>
+      </w:r>
+      <w:r>
+        <w:rPr>
+          <w:rFonts w:ascii="TimesNewRomanPS-BoldMT" w:hAnsi="TimesNewRomanPS-BoldMT"/>
+          <w:b/>
+          <w:bCs/>
+          <w:sz w:val="28"/>
+          <w:szCs w:val="28"/>
+          <w:lang w:val="en-US"/>
+        </w:rPr>
+        <w:t>2</w:t>
       </w:r>
     </w:p>
     <w:tbl>
@@ -1957,21 +1969,25 @@
     </w:p>
     <w:p>
       <w:pPr>
-        <w:pStyle w:val="afa"/>
+        <w:pStyle w:val="FirstParagraph"/>
+        <w:spacing w:before="0" w:after="0" w:line="360" w:lineRule="auto"/>
         <w:ind w:firstLine="709"/>
+        <w:jc w:val="both"/>
         <w:rPr>
+          <w:rFonts w:ascii="Times New Roman" w:eastAsia="Times New Roman" w:hAnsi="Times New Roman" w:cs="Times New Roman"/>
           <w:sz w:val="28"/>
           <w:szCs w:val="28"/>
-          <w:lang w:eastAsia="en-US"/>
+          <w:lang w:val="ru-RU"/>
         </w:rPr>
       </w:pPr>
       <w:r>
         <w:rPr>
+          <w:rFonts w:ascii="Times New Roman" w:eastAsia="Times New Roman" w:hAnsi="Times New Roman" w:cs="Times New Roman"/>
           <w:sz w:val="28"/>
           <w:szCs w:val="28"/>
-          <w:lang w:eastAsia="en-US"/>
+          <w:lang w:val="ru-RU"/>
         </w:rPr>
-        <w:t>Приложение предназначено для автоматизации управления гостиницей и ориентированно на персонал и гостей. Администраторы получают инструменты для управления бронированиями, заселением, оплатами, уборкой номеров и взаимодействием с гостями. Руководители могут анализировать ключевые показатели эффективности работы отеля, такие как загрузка номеров, ADR и RevPAR. Гости имеют возможность бронировать номера и производить оплату через веб-интерфейс или мобильное приложение. Система должна быть интегрирована с PMS и обеспечивать безопасное хранение данных.</w:t>
+        <w:t>Требуется система для организации сбора и вывоза твердых коммунальных отходов (ТКО). Система должна обеспечивать учет контейнерных площадок, маршрутов, графиков вывоза и работу с подрядными организациями</w:t>
       </w:r>
     </w:p>
     <w:p>
@@ -2199,7 +2215,7 @@
               <w:rPr>
                 <w:rFonts w:ascii="Times New Roman" w:hAnsi="Times New Roman" w:cs="Times New Roman"/>
               </w:rPr>
-              <w:t>Users</w:t>
+              <w:t>Routes</w:t>
             </w:r>
           </w:p>
         </w:tc>
@@ -2222,7 +2238,7 @@
                 <w:rFonts w:ascii="Times New Roman" w:hAnsi="Times New Roman" w:cs="Times New Roman"/>
                 <w:lang w:val="ru-RU"/>
               </w:rPr>
-              <w:t>Пользователи приложения</w:t>
+              <w:t>Маршруты</w:t>
             </w:r>
           </w:p>
         </w:tc>
@@ -2243,7 +2259,13 @@
               <w:rPr>
                 <w:rFonts w:ascii="Times New Roman" w:hAnsi="Times New Roman" w:cs="Times New Roman"/>
               </w:rPr>
-              <w:t>User_id</w:t>
+              <w:t>rout</w:t>
+            </w:r>
+            <w:r>
+              <w:rPr>
+                <w:rFonts w:ascii="Times New Roman" w:hAnsi="Times New Roman" w:cs="Times New Roman"/>
+              </w:rPr>
+              <w:t>_id</w:t>
             </w:r>
           </w:p>
         </w:tc>
@@ -2264,7 +2286,13 @@
               <w:rPr>
                 <w:rFonts w:ascii="Times New Roman" w:hAnsi="Times New Roman" w:cs="Times New Roman"/>
               </w:rPr>
-              <w:t xml:space="preserve"> login</w:t>
+              <w:t xml:space="preserve"> </w:t>
+            </w:r>
+            <w:r>
+              <w:rPr>
+                <w:rFonts w:ascii="Times New Roman" w:hAnsi="Times New Roman" w:cs="Times New Roman"/>
+              </w:rPr>
+              <w:t>title</w:t>
             </w:r>
           </w:p>
         </w:tc>
@@ -2285,7 +2313,7 @@
               <w:rPr>
                 <w:rFonts w:ascii="Times New Roman" w:hAnsi="Times New Roman" w:cs="Times New Roman"/>
               </w:rPr>
-              <w:t>login</w:t>
+              <w:t>title</w:t>
             </w:r>
           </w:p>
         </w:tc>
@@ -2312,7 +2340,7 @@
               <w:rPr>
                 <w:rFonts w:ascii="Times New Roman" w:hAnsi="Times New Roman" w:cs="Times New Roman"/>
               </w:rPr>
-              <w:t>Roles</w:t>
+              <w:t>Districts</w:t>
             </w:r>
           </w:p>
         </w:tc>
@@ -2335,7 +2363,7 @@
                 <w:rFonts w:ascii="Times New Roman" w:hAnsi="Times New Roman" w:cs="Times New Roman"/>
                 <w:lang w:val="ru-RU"/>
               </w:rPr>
-              <w:t>Роли пользователей</w:t>
+              <w:t xml:space="preserve">Районы </w:t>
             </w:r>
           </w:p>
         </w:tc>
@@ -2356,7 +2384,7 @@
               <w:rPr>
                 <w:rFonts w:ascii="Times New Roman" w:hAnsi="Times New Roman" w:cs="Times New Roman"/>
               </w:rPr>
-              <w:t>Role_id</w:t>
+              <w:t>District_id</w:t>
             </w:r>
           </w:p>
         </w:tc>
@@ -2425,7 +2453,7 @@
               <w:rPr>
                 <w:rFonts w:ascii="Times New Roman" w:hAnsi="Times New Roman" w:cs="Times New Roman"/>
               </w:rPr>
-              <w:t>Room_categories</w:t>
+              <w:t>Contractors</w:t>
             </w:r>
           </w:p>
         </w:tc>
@@ -2448,7 +2476,7 @@
                 <w:rFonts w:ascii="Times New Roman" w:hAnsi="Times New Roman" w:cs="Times New Roman"/>
                 <w:lang w:val="ru-RU"/>
               </w:rPr>
-              <w:t>Категории номеров</w:t>
+              <w:t>Подрядчики</w:t>
             </w:r>
           </w:p>
         </w:tc>
@@ -2469,7 +2497,252 @@
               <w:rPr>
                 <w:rFonts w:ascii="Times New Roman" w:hAnsi="Times New Roman" w:cs="Times New Roman"/>
               </w:rPr>
-              <w:t>Category_id</w:t>
+              <w:t>contractor</w:t>
+            </w:r>
+            <w:r>
+              <w:rPr>
+                <w:rFonts w:ascii="Times New Roman" w:hAnsi="Times New Roman" w:cs="Times New Roman"/>
+              </w:rPr>
+              <w:t>_id</w:t>
+            </w:r>
+          </w:p>
+        </w:tc>
+        <w:tc>
+          <w:tcPr>
+            <w:tcW w:w="1869" w:type="dxa"/>
+            <w:vAlign w:val="center"/>
+          </w:tcPr>
+          <w:p>
+            <w:pPr>
+              <w:pStyle w:val="Compact"/>
+              <w:spacing w:before="0" w:after="0"/>
+              <w:rPr>
+                <w:rFonts w:ascii="Times New Roman" w:hAnsi="Times New Roman" w:cs="Times New Roman"/>
+              </w:rPr>
+            </w:pPr>
+            <w:r>
+              <w:rPr>
+                <w:rFonts w:ascii="Times New Roman" w:hAnsi="Times New Roman" w:cs="Times New Roman"/>
+              </w:rPr>
+              <w:t>-</w:t>
+            </w:r>
+          </w:p>
+        </w:tc>
+        <w:tc>
+          <w:tcPr>
+            <w:tcW w:w="1869" w:type="dxa"/>
+            <w:vAlign w:val="center"/>
+          </w:tcPr>
+          <w:p>
+            <w:pPr>
+              <w:pStyle w:val="Compact"/>
+              <w:spacing w:before="0" w:after="0"/>
+              <w:rPr>
+                <w:rFonts w:ascii="Times New Roman" w:hAnsi="Times New Roman" w:cs="Times New Roman"/>
+              </w:rPr>
+            </w:pPr>
+            <w:r>
+              <w:rPr>
+                <w:rFonts w:ascii="Times New Roman" w:hAnsi="Times New Roman" w:cs="Times New Roman"/>
+              </w:rPr>
+              <w:t>-</w:t>
+            </w:r>
+          </w:p>
+        </w:tc>
+      </w:tr>
+      <w:tr>
+        <w:trPr>
+          <w:cnfStyle w:val="100000000000" w:firstRow="1" w:lastRow="0" w:firstColumn="0" w:lastColumn="0" w:oddVBand="0" w:evenVBand="0" w:oddHBand="0" w:evenHBand="0" w:firstRowFirstColumn="0" w:firstRowLastColumn="0" w:lastRowFirstColumn="0" w:lastRowLastColumn="0"/>
+          <w:trHeight w:val="378"/>
+          <w:tblHeader/>
+        </w:trPr>
+        <w:tc>
+          <w:tcPr>
+            <w:tcW w:w="1869" w:type="dxa"/>
+            <w:vAlign w:val="center"/>
+          </w:tcPr>
+          <w:p>
+            <w:pPr>
+              <w:pStyle w:val="Compact"/>
+              <w:spacing w:before="0" w:after="0"/>
+              <w:rPr>
+                <w:rFonts w:ascii="Times New Roman" w:hAnsi="Times New Roman" w:cs="Times New Roman"/>
+              </w:rPr>
+            </w:pPr>
+            <w:r>
+              <w:rPr>
+                <w:rFonts w:ascii="Times New Roman" w:hAnsi="Times New Roman" w:cs="Times New Roman"/>
+              </w:rPr>
+              <w:t>Work_areas</w:t>
+            </w:r>
+          </w:p>
+        </w:tc>
+        <w:tc>
+          <w:tcPr>
+            <w:tcW w:w="1869" w:type="dxa"/>
+            <w:vAlign w:val="center"/>
+          </w:tcPr>
+          <w:p>
+            <w:pPr>
+              <w:pStyle w:val="Compact"/>
+              <w:spacing w:before="0" w:after="0"/>
+              <w:rPr>
+                <w:rFonts w:ascii="Times New Roman" w:hAnsi="Times New Roman" w:cs="Times New Roman"/>
+                <w:lang w:val="ru-RU"/>
+              </w:rPr>
+            </w:pPr>
+            <w:r>
+              <w:rPr>
+                <w:rFonts w:ascii="Times New Roman" w:hAnsi="Times New Roman" w:cs="Times New Roman"/>
+                <w:lang w:val="ru-RU"/>
+              </w:rPr>
+              <w:t>Площадки</w:t>
+            </w:r>
+          </w:p>
+        </w:tc>
+        <w:tc>
+          <w:tcPr>
+            <w:tcW w:w="1869" w:type="dxa"/>
+            <w:vAlign w:val="center"/>
+          </w:tcPr>
+          <w:p>
+            <w:pPr>
+              <w:pStyle w:val="Compact"/>
+              <w:spacing w:before="0" w:after="0"/>
+              <w:rPr>
+                <w:rFonts w:ascii="Times New Roman" w:hAnsi="Times New Roman" w:cs="Times New Roman"/>
+              </w:rPr>
+            </w:pPr>
+            <w:r>
+              <w:rPr>
+                <w:rFonts w:ascii="Times New Roman" w:hAnsi="Times New Roman" w:cs="Times New Roman"/>
+              </w:rPr>
+              <w:t>area</w:t>
+            </w:r>
+            <w:r>
+              <w:rPr>
+                <w:rFonts w:ascii="Times New Roman" w:hAnsi="Times New Roman" w:cs="Times New Roman"/>
+              </w:rPr>
+              <w:t>_id</w:t>
+            </w:r>
+          </w:p>
+        </w:tc>
+        <w:tc>
+          <w:tcPr>
+            <w:tcW w:w="1869" w:type="dxa"/>
+            <w:vAlign w:val="center"/>
+          </w:tcPr>
+          <w:p>
+            <w:pPr>
+              <w:pStyle w:val="Compact"/>
+              <w:spacing w:before="0" w:after="0"/>
+              <w:rPr>
+                <w:rFonts w:ascii="Times New Roman" w:hAnsi="Times New Roman" w:cs="Times New Roman"/>
+              </w:rPr>
+            </w:pPr>
+            <w:r>
+              <w:rPr>
+                <w:rFonts w:ascii="Times New Roman" w:hAnsi="Times New Roman" w:cs="Times New Roman"/>
+              </w:rPr>
+              <w:t>address</w:t>
+            </w:r>
+          </w:p>
+        </w:tc>
+        <w:tc>
+          <w:tcPr>
+            <w:tcW w:w="1869" w:type="dxa"/>
+            <w:vAlign w:val="center"/>
+          </w:tcPr>
+          <w:p>
+            <w:pPr>
+              <w:pStyle w:val="Compact"/>
+              <w:spacing w:before="0" w:after="0"/>
+              <w:rPr>
+                <w:rFonts w:ascii="Times New Roman" w:hAnsi="Times New Roman" w:cs="Times New Roman"/>
+              </w:rPr>
+            </w:pPr>
+            <w:r>
+              <w:rPr>
+                <w:rFonts w:ascii="Times New Roman" w:hAnsi="Times New Roman" w:cs="Times New Roman"/>
+              </w:rPr>
+              <w:t>address</w:t>
+            </w:r>
+          </w:p>
+        </w:tc>
+      </w:tr>
+      <w:tr>
+        <w:trPr>
+          <w:cnfStyle w:val="100000000000" w:firstRow="1" w:lastRow="0" w:firstColumn="0" w:lastColumn="0" w:oddVBand="0" w:evenVBand="0" w:oddHBand="0" w:evenHBand="0" w:firstRowFirstColumn="0" w:firstRowLastColumn="0" w:lastRowFirstColumn="0" w:lastRowLastColumn="0"/>
+          <w:tblHeader/>
+        </w:trPr>
+        <w:tc>
+          <w:tcPr>
+            <w:tcW w:w="1869" w:type="dxa"/>
+            <w:vAlign w:val="center"/>
+          </w:tcPr>
+          <w:p>
+            <w:pPr>
+              <w:pStyle w:val="Compact"/>
+              <w:spacing w:before="0" w:after="0"/>
+              <w:rPr>
+                <w:rFonts w:ascii="Times New Roman" w:hAnsi="Times New Roman" w:cs="Times New Roman"/>
+              </w:rPr>
+            </w:pPr>
+            <w:r>
+              <w:rPr>
+                <w:rFonts w:ascii="Times New Roman" w:hAnsi="Times New Roman" w:cs="Times New Roman"/>
+              </w:rPr>
+              <w:t>Containers</w:t>
+            </w:r>
+          </w:p>
+        </w:tc>
+        <w:tc>
+          <w:tcPr>
+            <w:tcW w:w="1869" w:type="dxa"/>
+            <w:vAlign w:val="center"/>
+          </w:tcPr>
+          <w:p>
+            <w:pPr>
+              <w:pStyle w:val="Compact"/>
+              <w:spacing w:before="0" w:after="0"/>
+              <w:rPr>
+                <w:rFonts w:ascii="Times New Roman" w:hAnsi="Times New Roman" w:cs="Times New Roman"/>
+                <w:lang w:val="ru-RU"/>
+              </w:rPr>
+            </w:pPr>
+            <w:r>
+              <w:rPr>
+                <w:rFonts w:ascii="Times New Roman" w:hAnsi="Times New Roman" w:cs="Times New Roman"/>
+                <w:lang w:val="ru-RU"/>
+              </w:rPr>
+              <w:t>Контейнеры</w:t>
+            </w:r>
+          </w:p>
+        </w:tc>
+        <w:tc>
+          <w:tcPr>
+            <w:tcW w:w="1869" w:type="dxa"/>
+            <w:vAlign w:val="center"/>
+          </w:tcPr>
+          <w:p>
+            <w:pPr>
+              <w:pStyle w:val="Compact"/>
+              <w:spacing w:before="0" w:after="0"/>
+              <w:rPr>
+                <w:rFonts w:ascii="Times New Roman" w:hAnsi="Times New Roman" w:cs="Times New Roman"/>
+              </w:rPr>
+            </w:pPr>
+            <w:r>
+              <w:rPr>
+                <w:rFonts w:ascii="Times New Roman" w:hAnsi="Times New Roman" w:cs="Times New Roman"/>
+              </w:rPr>
+              <w:t>Container_</w:t>
+            </w:r>
+            <w:r>
+              <w:rPr>
+                <w:rFonts w:ascii="Times New Roman" w:hAnsi="Times New Roman" w:cs="Times New Roman"/>
+              </w:rPr>
+              <w:t>id</w:t>
             </w:r>
           </w:p>
         </w:tc>
@@ -2538,7 +2811,7 @@
               <w:rPr>
                 <w:rFonts w:ascii="Times New Roman" w:hAnsi="Times New Roman" w:cs="Times New Roman"/>
               </w:rPr>
-              <w:t>Floors</w:t>
+              <w:t>Reports</w:t>
             </w:r>
           </w:p>
         </w:tc>
@@ -2561,7 +2834,7 @@
                 <w:rFonts w:ascii="Times New Roman" w:hAnsi="Times New Roman" w:cs="Times New Roman"/>
                 <w:lang w:val="ru-RU"/>
               </w:rPr>
-              <w:t>Этажи</w:t>
+              <w:t>Отчеты на дату</w:t>
             </w:r>
           </w:p>
         </w:tc>
@@ -2582,7 +2855,7 @@
               <w:rPr>
                 <w:rFonts w:ascii="Times New Roman" w:hAnsi="Times New Roman" w:cs="Times New Roman"/>
               </w:rPr>
-              <w:t>Floor_id</w:t>
+              <w:t>Report_date</w:t>
             </w:r>
           </w:p>
         </w:tc>
@@ -2625,585 +2898,6 @@
                 <w:rFonts w:ascii="Times New Roman" w:hAnsi="Times New Roman" w:cs="Times New Roman"/>
               </w:rPr>
               <w:t>-</w:t>
-            </w:r>
-          </w:p>
-        </w:tc>
-      </w:tr>
-      <w:tr>
-        <w:trPr>
-          <w:cnfStyle w:val="100000000000" w:firstRow="1" w:lastRow="0" w:firstColumn="0" w:lastColumn="0" w:oddVBand="0" w:evenVBand="0" w:oddHBand="0" w:evenHBand="0" w:firstRowFirstColumn="0" w:firstRowLastColumn="0" w:lastRowFirstColumn="0" w:lastRowLastColumn="0"/>
-          <w:tblHeader/>
-        </w:trPr>
-        <w:tc>
-          <w:tcPr>
-            <w:tcW w:w="1869" w:type="dxa"/>
-            <w:vAlign w:val="center"/>
-          </w:tcPr>
-          <w:p>
-            <w:pPr>
-              <w:pStyle w:val="Compact"/>
-              <w:spacing w:before="0" w:after="0"/>
-              <w:rPr>
-                <w:rFonts w:ascii="Times New Roman" w:hAnsi="Times New Roman" w:cs="Times New Roman"/>
-              </w:rPr>
-            </w:pPr>
-            <w:r>
-              <w:rPr>
-                <w:rFonts w:ascii="Times New Roman" w:hAnsi="Times New Roman" w:cs="Times New Roman"/>
-              </w:rPr>
-              <w:t>Room</w:t>
-            </w:r>
-            <w:r>
-              <w:rPr>
-                <w:rFonts w:ascii="Times New Roman" w:hAnsi="Times New Roman" w:cs="Times New Roman"/>
-              </w:rPr>
-              <w:t>_funds</w:t>
-            </w:r>
-          </w:p>
-        </w:tc>
-        <w:tc>
-          <w:tcPr>
-            <w:tcW w:w="1869" w:type="dxa"/>
-            <w:vAlign w:val="center"/>
-          </w:tcPr>
-          <w:p>
-            <w:pPr>
-              <w:pStyle w:val="Compact"/>
-              <w:spacing w:before="0" w:after="0"/>
-              <w:rPr>
-                <w:rFonts w:ascii="Times New Roman" w:hAnsi="Times New Roman" w:cs="Times New Roman"/>
-                <w:lang w:val="ru-RU"/>
-              </w:rPr>
-            </w:pPr>
-            <w:r>
-              <w:rPr>
-                <w:rFonts w:ascii="Times New Roman" w:hAnsi="Times New Roman" w:cs="Times New Roman"/>
-                <w:lang w:val="ru-RU"/>
-              </w:rPr>
-              <w:t>Номера</w:t>
-            </w:r>
-          </w:p>
-        </w:tc>
-        <w:tc>
-          <w:tcPr>
-            <w:tcW w:w="1869" w:type="dxa"/>
-            <w:vAlign w:val="center"/>
-          </w:tcPr>
-          <w:p>
-            <w:pPr>
-              <w:pStyle w:val="Compact"/>
-              <w:spacing w:before="0" w:after="0"/>
-              <w:rPr>
-                <w:rFonts w:ascii="Times New Roman" w:hAnsi="Times New Roman" w:cs="Times New Roman"/>
-              </w:rPr>
-            </w:pPr>
-            <w:r>
-              <w:rPr>
-                <w:rFonts w:ascii="Times New Roman" w:hAnsi="Times New Roman" w:cs="Times New Roman"/>
-              </w:rPr>
-              <w:t>Room</w:t>
-            </w:r>
-            <w:r>
-              <w:rPr>
-                <w:rFonts w:ascii="Times New Roman" w:hAnsi="Times New Roman" w:cs="Times New Roman"/>
-              </w:rPr>
-              <w:t>_fund</w:t>
-            </w:r>
-            <w:r>
-              <w:rPr>
-                <w:rFonts w:ascii="Times New Roman" w:hAnsi="Times New Roman" w:cs="Times New Roman"/>
-              </w:rPr>
-              <w:t>_id</w:t>
-            </w:r>
-          </w:p>
-        </w:tc>
-        <w:tc>
-          <w:tcPr>
-            <w:tcW w:w="1869" w:type="dxa"/>
-            <w:vAlign w:val="center"/>
-          </w:tcPr>
-          <w:p>
-            <w:pPr>
-              <w:pStyle w:val="Compact"/>
-              <w:spacing w:before="0" w:after="0"/>
-              <w:rPr>
-                <w:rFonts w:ascii="Times New Roman" w:hAnsi="Times New Roman" w:cs="Times New Roman"/>
-              </w:rPr>
-            </w:pPr>
-            <w:r>
-              <w:rPr>
-                <w:rFonts w:ascii="Times New Roman" w:hAnsi="Times New Roman" w:cs="Times New Roman"/>
-              </w:rPr>
-              <w:t>-</w:t>
-            </w:r>
-          </w:p>
-        </w:tc>
-        <w:tc>
-          <w:tcPr>
-            <w:tcW w:w="1869" w:type="dxa"/>
-            <w:vAlign w:val="center"/>
-          </w:tcPr>
-          <w:p>
-            <w:pPr>
-              <w:pStyle w:val="Compact"/>
-              <w:spacing w:before="0" w:after="0"/>
-              <w:rPr>
-                <w:rFonts w:ascii="Times New Roman" w:hAnsi="Times New Roman" w:cs="Times New Roman"/>
-              </w:rPr>
-            </w:pPr>
-            <w:r>
-              <w:rPr>
-                <w:rFonts w:ascii="Times New Roman" w:hAnsi="Times New Roman" w:cs="Times New Roman"/>
-              </w:rPr>
-              <w:t>-</w:t>
-            </w:r>
-          </w:p>
-        </w:tc>
-      </w:tr>
-      <w:tr>
-        <w:trPr>
-          <w:cnfStyle w:val="100000000000" w:firstRow="1" w:lastRow="0" w:firstColumn="0" w:lastColumn="0" w:oddVBand="0" w:evenVBand="0" w:oddHBand="0" w:evenHBand="0" w:firstRowFirstColumn="0" w:firstRowLastColumn="0" w:lastRowFirstColumn="0" w:lastRowLastColumn="0"/>
-          <w:tblHeader/>
-        </w:trPr>
-        <w:tc>
-          <w:tcPr>
-            <w:tcW w:w="1869" w:type="dxa"/>
-            <w:vAlign w:val="center"/>
-          </w:tcPr>
-          <w:p>
-            <w:pPr>
-              <w:pStyle w:val="Compact"/>
-              <w:spacing w:before="0" w:after="0"/>
-              <w:rPr>
-                <w:rFonts w:ascii="Times New Roman" w:hAnsi="Times New Roman" w:cs="Times New Roman"/>
-              </w:rPr>
-            </w:pPr>
-            <w:r>
-              <w:rPr>
-                <w:rFonts w:ascii="Times New Roman" w:hAnsi="Times New Roman" w:cs="Times New Roman"/>
-              </w:rPr>
-              <w:t>Statuses</w:t>
-            </w:r>
-          </w:p>
-        </w:tc>
-        <w:tc>
-          <w:tcPr>
-            <w:tcW w:w="1869" w:type="dxa"/>
-            <w:vAlign w:val="center"/>
-          </w:tcPr>
-          <w:p>
-            <w:pPr>
-              <w:pStyle w:val="Compact"/>
-              <w:spacing w:before="0" w:after="0"/>
-              <w:rPr>
-                <w:rFonts w:ascii="Times New Roman" w:hAnsi="Times New Roman" w:cs="Times New Roman"/>
-                <w:lang w:val="ru-RU"/>
-              </w:rPr>
-            </w:pPr>
-            <w:r>
-              <w:rPr>
-                <w:rFonts w:ascii="Times New Roman" w:hAnsi="Times New Roman" w:cs="Times New Roman"/>
-                <w:lang w:val="ru-RU"/>
-              </w:rPr>
-              <w:t>Статусы номеров</w:t>
-            </w:r>
-          </w:p>
-        </w:tc>
-        <w:tc>
-          <w:tcPr>
-            <w:tcW w:w="1869" w:type="dxa"/>
-            <w:vAlign w:val="center"/>
-          </w:tcPr>
-          <w:p>
-            <w:pPr>
-              <w:pStyle w:val="Compact"/>
-              <w:spacing w:before="0" w:after="0"/>
-              <w:rPr>
-                <w:rFonts w:ascii="Times New Roman" w:hAnsi="Times New Roman" w:cs="Times New Roman"/>
-              </w:rPr>
-            </w:pPr>
-            <w:r>
-              <w:rPr>
-                <w:rFonts w:ascii="Times New Roman" w:hAnsi="Times New Roman" w:cs="Times New Roman"/>
-              </w:rPr>
-              <w:t>Status_id</w:t>
-            </w:r>
-          </w:p>
-        </w:tc>
-        <w:tc>
-          <w:tcPr>
-            <w:tcW w:w="1869" w:type="dxa"/>
-            <w:vAlign w:val="center"/>
-          </w:tcPr>
-          <w:p>
-            <w:pPr>
-              <w:pStyle w:val="Compact"/>
-              <w:spacing w:before="0" w:after="0"/>
-              <w:rPr>
-                <w:rFonts w:ascii="Times New Roman" w:hAnsi="Times New Roman" w:cs="Times New Roman"/>
-              </w:rPr>
-            </w:pPr>
-            <w:r>
-              <w:rPr>
-                <w:rFonts w:ascii="Times New Roman" w:hAnsi="Times New Roman" w:cs="Times New Roman"/>
-              </w:rPr>
-              <w:t>-</w:t>
-            </w:r>
-          </w:p>
-        </w:tc>
-        <w:tc>
-          <w:tcPr>
-            <w:tcW w:w="1869" w:type="dxa"/>
-            <w:vAlign w:val="center"/>
-          </w:tcPr>
-          <w:p>
-            <w:pPr>
-              <w:pStyle w:val="Compact"/>
-              <w:spacing w:before="0" w:after="0"/>
-              <w:rPr>
-                <w:rFonts w:ascii="Times New Roman" w:hAnsi="Times New Roman" w:cs="Times New Roman"/>
-              </w:rPr>
-            </w:pPr>
-            <w:r>
-              <w:rPr>
-                <w:rFonts w:ascii="Times New Roman" w:hAnsi="Times New Roman" w:cs="Times New Roman"/>
-              </w:rPr>
-              <w:t>-</w:t>
-            </w:r>
-          </w:p>
-        </w:tc>
-      </w:tr>
-      <w:tr>
-        <w:trPr>
-          <w:cnfStyle w:val="100000000000" w:firstRow="1" w:lastRow="0" w:firstColumn="0" w:lastColumn="0" w:oddVBand="0" w:evenVBand="0" w:oddHBand="0" w:evenHBand="0" w:firstRowFirstColumn="0" w:firstRowLastColumn="0" w:lastRowFirstColumn="0" w:lastRowLastColumn="0"/>
-          <w:tblHeader/>
-        </w:trPr>
-        <w:tc>
-          <w:tcPr>
-            <w:tcW w:w="1869" w:type="dxa"/>
-            <w:vAlign w:val="center"/>
-          </w:tcPr>
-          <w:p>
-            <w:pPr>
-              <w:pStyle w:val="Compact"/>
-              <w:spacing w:before="0" w:after="0"/>
-              <w:rPr>
-                <w:rFonts w:ascii="Times New Roman" w:hAnsi="Times New Roman" w:cs="Times New Roman"/>
-              </w:rPr>
-            </w:pPr>
-            <w:r>
-              <w:rPr>
-                <w:rFonts w:ascii="Times New Roman" w:hAnsi="Times New Roman" w:cs="Times New Roman"/>
-              </w:rPr>
-              <w:t>Reports</w:t>
-            </w:r>
-          </w:p>
-        </w:tc>
-        <w:tc>
-          <w:tcPr>
-            <w:tcW w:w="1869" w:type="dxa"/>
-            <w:vAlign w:val="center"/>
-          </w:tcPr>
-          <w:p>
-            <w:pPr>
-              <w:pStyle w:val="Compact"/>
-              <w:spacing w:before="0" w:after="0"/>
-              <w:rPr>
-                <w:rFonts w:ascii="Times New Roman" w:hAnsi="Times New Roman" w:cs="Times New Roman"/>
-                <w:lang w:val="ru-RU"/>
-              </w:rPr>
-            </w:pPr>
-            <w:r>
-              <w:rPr>
-                <w:rFonts w:ascii="Times New Roman" w:hAnsi="Times New Roman" w:cs="Times New Roman"/>
-                <w:lang w:val="ru-RU"/>
-              </w:rPr>
-              <w:t>Отчеты по номерам</w:t>
-            </w:r>
-          </w:p>
-        </w:tc>
-        <w:tc>
-          <w:tcPr>
-            <w:tcW w:w="1869" w:type="dxa"/>
-            <w:vAlign w:val="center"/>
-          </w:tcPr>
-          <w:p>
-            <w:pPr>
-              <w:pStyle w:val="Compact"/>
-              <w:spacing w:before="0" w:after="0"/>
-              <w:rPr>
-                <w:rFonts w:ascii="Times New Roman" w:hAnsi="Times New Roman" w:cs="Times New Roman"/>
-              </w:rPr>
-            </w:pPr>
-            <w:r>
-              <w:rPr>
-                <w:rFonts w:ascii="Times New Roman" w:hAnsi="Times New Roman" w:cs="Times New Roman"/>
-              </w:rPr>
-              <w:t>Report_id</w:t>
-            </w:r>
-          </w:p>
-        </w:tc>
-        <w:tc>
-          <w:tcPr>
-            <w:tcW w:w="1869" w:type="dxa"/>
-            <w:vAlign w:val="center"/>
-          </w:tcPr>
-          <w:p>
-            <w:pPr>
-              <w:pStyle w:val="Compact"/>
-              <w:spacing w:before="0" w:after="0"/>
-              <w:rPr>
-                <w:rFonts w:ascii="Times New Roman" w:hAnsi="Times New Roman" w:cs="Times New Roman"/>
-              </w:rPr>
-            </w:pPr>
-            <w:r>
-              <w:rPr>
-                <w:rFonts w:ascii="Times New Roman" w:hAnsi="Times New Roman" w:cs="Times New Roman"/>
-              </w:rPr>
-              <w:t>-</w:t>
-            </w:r>
-          </w:p>
-        </w:tc>
-        <w:tc>
-          <w:tcPr>
-            <w:tcW w:w="1869" w:type="dxa"/>
-            <w:vAlign w:val="center"/>
-          </w:tcPr>
-          <w:p>
-            <w:pPr>
-              <w:pStyle w:val="Compact"/>
-              <w:spacing w:before="0" w:after="0"/>
-              <w:rPr>
-                <w:rFonts w:ascii="Times New Roman" w:hAnsi="Times New Roman" w:cs="Times New Roman"/>
-              </w:rPr>
-            </w:pPr>
-            <w:r>
-              <w:rPr>
-                <w:rFonts w:ascii="Times New Roman" w:hAnsi="Times New Roman" w:cs="Times New Roman"/>
-              </w:rPr>
-              <w:t>-</w:t>
-            </w:r>
-          </w:p>
-        </w:tc>
-      </w:tr>
-      <w:tr>
-        <w:tc>
-          <w:tcPr>
-            <w:tcW w:w="1869" w:type="dxa"/>
-            <w:vAlign w:val="center"/>
-          </w:tcPr>
-          <w:p>
-            <w:pPr>
-              <w:pStyle w:val="Compact"/>
-              <w:spacing w:before="0" w:after="0"/>
-              <w:rPr>
-                <w:rFonts w:ascii="Times New Roman" w:hAnsi="Times New Roman" w:cs="Times New Roman"/>
-              </w:rPr>
-            </w:pPr>
-            <w:r>
-              <w:rPr>
-                <w:rFonts w:ascii="Times New Roman" w:hAnsi="Times New Roman" w:cs="Times New Roman"/>
-              </w:rPr>
-              <w:t>Clients</w:t>
-            </w:r>
-          </w:p>
-        </w:tc>
-        <w:tc>
-          <w:tcPr>
-            <w:tcW w:w="1869" w:type="dxa"/>
-            <w:vAlign w:val="center"/>
-          </w:tcPr>
-          <w:p>
-            <w:pPr>
-              <w:pStyle w:val="Compact"/>
-              <w:spacing w:before="0" w:after="0"/>
-              <w:rPr>
-                <w:rFonts w:ascii="Times New Roman" w:hAnsi="Times New Roman" w:cs="Times New Roman"/>
-              </w:rPr>
-            </w:pPr>
-            <w:r>
-              <w:rPr>
-                <w:rFonts w:ascii="Times New Roman" w:hAnsi="Times New Roman" w:cs="Times New Roman"/>
-              </w:rPr>
-              <w:t xml:space="preserve">Клиенты </w:t>
-            </w:r>
-          </w:p>
-        </w:tc>
-        <w:tc>
-          <w:tcPr>
-            <w:tcW w:w="1869" w:type="dxa"/>
-            <w:vAlign w:val="center"/>
-          </w:tcPr>
-          <w:p>
-            <w:pPr>
-              <w:pStyle w:val="Compact"/>
-              <w:spacing w:before="0" w:after="0"/>
-              <w:rPr>
-                <w:rFonts w:ascii="Times New Roman" w:hAnsi="Times New Roman" w:cs="Times New Roman"/>
-              </w:rPr>
-            </w:pPr>
-            <w:r>
-              <w:rPr>
-                <w:rFonts w:ascii="Times New Roman" w:hAnsi="Times New Roman" w:cs="Times New Roman"/>
-              </w:rPr>
-              <w:t>client</w:t>
-            </w:r>
-            <w:r>
-              <w:rPr>
-                <w:rFonts w:ascii="Times New Roman" w:hAnsi="Times New Roman" w:cs="Times New Roman"/>
-              </w:rPr>
-              <w:t>_id</w:t>
-            </w:r>
-          </w:p>
-        </w:tc>
-        <w:tc>
-          <w:tcPr>
-            <w:tcW w:w="1869" w:type="dxa"/>
-            <w:vAlign w:val="center"/>
-          </w:tcPr>
-          <w:p>
-            <w:pPr>
-              <w:pStyle w:val="Compact"/>
-              <w:spacing w:before="0" w:after="0"/>
-              <w:rPr>
-                <w:rFonts w:ascii="Times New Roman" w:hAnsi="Times New Roman" w:cs="Times New Roman"/>
-              </w:rPr>
-            </w:pPr>
-            <w:r>
-              <w:rPr>
-                <w:rFonts w:ascii="Times New Roman" w:hAnsi="Times New Roman" w:cs="Times New Roman"/>
-              </w:rPr>
-              <w:t>-</w:t>
-            </w:r>
-          </w:p>
-        </w:tc>
-        <w:tc>
-          <w:tcPr>
-            <w:tcW w:w="1869" w:type="dxa"/>
-            <w:vAlign w:val="center"/>
-          </w:tcPr>
-          <w:p>
-            <w:pPr>
-              <w:pStyle w:val="Compact"/>
-              <w:spacing w:before="0" w:after="0"/>
-              <w:rPr>
-                <w:rFonts w:ascii="Times New Roman" w:hAnsi="Times New Roman" w:cs="Times New Roman"/>
-              </w:rPr>
-            </w:pPr>
-            <w:r>
-              <w:rPr>
-                <w:rFonts w:ascii="Times New Roman" w:hAnsi="Times New Roman" w:cs="Times New Roman"/>
-              </w:rPr>
-              <w:t>email уникален</w:t>
-            </w:r>
-          </w:p>
-        </w:tc>
-      </w:tr>
-      <w:tr>
-        <w:tc>
-          <w:tcPr>
-            <w:tcW w:w="1869" w:type="dxa"/>
-            <w:vAlign w:val="center"/>
-          </w:tcPr>
-          <w:p>
-            <w:pPr>
-              <w:pStyle w:val="Compact"/>
-              <w:spacing w:before="0" w:after="0"/>
-              <w:rPr>
-                <w:rFonts w:ascii="Times New Roman" w:hAnsi="Times New Roman" w:cs="Times New Roman"/>
-              </w:rPr>
-            </w:pPr>
-            <w:r>
-              <w:rPr>
-                <w:rFonts w:ascii="Times New Roman" w:hAnsi="Times New Roman" w:cs="Times New Roman"/>
-              </w:rPr>
-              <w:t>Reservations</w:t>
-            </w:r>
-          </w:p>
-        </w:tc>
-        <w:tc>
-          <w:tcPr>
-            <w:tcW w:w="1869" w:type="dxa"/>
-            <w:vAlign w:val="center"/>
-          </w:tcPr>
-          <w:p>
-            <w:pPr>
-              <w:pStyle w:val="Compact"/>
-              <w:spacing w:before="0" w:after="0"/>
-              <w:rPr>
-                <w:rFonts w:ascii="Times New Roman" w:hAnsi="Times New Roman" w:cs="Times New Roman"/>
-                <w:lang w:val="ru-RU"/>
-              </w:rPr>
-            </w:pPr>
-            <w:r>
-              <w:rPr>
-                <w:rFonts w:ascii="Times New Roman" w:hAnsi="Times New Roman" w:cs="Times New Roman"/>
-                <w:lang w:val="ru-RU"/>
-              </w:rPr>
-              <w:t>Забронированные номера</w:t>
-            </w:r>
-          </w:p>
-        </w:tc>
-        <w:tc>
-          <w:tcPr>
-            <w:tcW w:w="1869" w:type="dxa"/>
-            <w:vAlign w:val="center"/>
-          </w:tcPr>
-          <w:p>
-            <w:pPr>
-              <w:pStyle w:val="Compact"/>
-              <w:spacing w:before="0" w:after="0"/>
-              <w:rPr>
-                <w:rFonts w:ascii="Times New Roman" w:hAnsi="Times New Roman" w:cs="Times New Roman"/>
-              </w:rPr>
-            </w:pPr>
-            <w:r>
-              <w:rPr>
-                <w:rFonts w:ascii="Times New Roman" w:hAnsi="Times New Roman" w:cs="Times New Roman"/>
-              </w:rPr>
-              <w:t>Reservation_id</w:t>
-            </w:r>
-          </w:p>
-        </w:tc>
-        <w:tc>
-          <w:tcPr>
-            <w:tcW w:w="1869" w:type="dxa"/>
-            <w:vAlign w:val="center"/>
-          </w:tcPr>
-          <w:p>
-            <w:pPr>
-              <w:pStyle w:val="Compact"/>
-              <w:spacing w:before="0" w:after="0"/>
-              <w:rPr>
-                <w:rFonts w:ascii="Times New Roman" w:hAnsi="Times New Roman" w:cs="Times New Roman"/>
-              </w:rPr>
-            </w:pPr>
-            <w:r>
-              <w:rPr>
-                <w:rFonts w:ascii="Times New Roman" w:hAnsi="Times New Roman" w:cs="Times New Roman"/>
-              </w:rPr>
-              <w:t>-</w:t>
-            </w:r>
-          </w:p>
-        </w:tc>
-        <w:tc>
-          <w:tcPr>
-            <w:tcW w:w="1869" w:type="dxa"/>
-            <w:vAlign w:val="center"/>
-          </w:tcPr>
-          <w:p>
-            <w:pPr>
-              <w:pStyle w:val="Compact"/>
-              <w:spacing w:before="0" w:after="0"/>
-              <w:rPr>
-                <w:rFonts w:ascii="Times New Roman" w:hAnsi="Times New Roman" w:cs="Times New Roman"/>
-              </w:rPr>
-            </w:pPr>
-            <w:r>
-              <w:rPr>
-                <w:rFonts w:ascii="Times New Roman" w:hAnsi="Times New Roman" w:cs="Times New Roman"/>
-              </w:rPr>
-              <w:t>Arrival_date &lt; leaving_date</w:t>
             </w:r>
           </w:p>
         </w:tc>
@@ -3247,7 +2941,31 @@
         <w:rPr>
           <w:lang w:val="en-US"/>
         </w:rPr>
-        <w:t>1. Users – Roles =&gt; M</w:t>
+        <w:t xml:space="preserve">1. </w:t>
+      </w:r>
+      <w:r>
+        <w:rPr>
+          <w:lang w:val="en-US"/>
+        </w:rPr>
+        <w:t>Routes</w:t>
+      </w:r>
+      <w:r>
+        <w:rPr>
+          <w:lang w:val="en-US"/>
+        </w:rPr>
+        <w:t xml:space="preserve"> –</w:t>
+      </w:r>
+      <w:r>
+        <w:rPr>
+          <w:lang w:val="en-US"/>
+        </w:rPr>
+        <w:t xml:space="preserve"> Districts </w:t>
+      </w:r>
+      <w:r>
+        <w:rPr>
+          <w:lang w:val="en-US"/>
+        </w:rPr>
+        <w:t>=&gt; M</w:t>
       </w:r>
       <w:r>
         <w:rPr>
@@ -3267,99 +2985,30 @@
         <w:rPr>
           <w:lang w:val="en-US"/>
         </w:rPr>
-        <w:t xml:space="preserve">2. Room_Funds – Floors =&gt; </w:t>
+        <w:t>2.</w:t>
       </w:r>
       <w:r>
         <w:rPr>
           <w:lang w:val="en-US"/>
         </w:rPr>
-        <w:t>M:1</w:t>
-      </w:r>
-    </w:p>
-    <w:p>
-      <w:pPr>
-        <w:pStyle w:val="TMS"/>
-        <w:rPr>
-          <w:lang w:val="en-US"/>
-        </w:rPr>
-      </w:pPr>
-      <w:r>
-        <w:rPr>
-          <w:lang w:val="en-US"/>
-        </w:rPr>
-        <w:t xml:space="preserve">3. Room_Funds – Categories =&gt; </w:t>
+        <w:t>Routes</w:t>
       </w:r>
       <w:r>
         <w:rPr>
           <w:lang w:val="en-US"/>
         </w:rPr>
-        <w:t>M:1</w:t>
-      </w:r>
-    </w:p>
-    <w:p>
-      <w:pPr>
-        <w:pStyle w:val="TMS"/>
-        <w:rPr>
-          <w:lang w:val="en-US"/>
-        </w:rPr>
-      </w:pPr>
-      <w:r>
-        <w:rPr>
-          <w:lang w:val="en-US"/>
-        </w:rPr>
-        <w:t>4. Reports</w:t>
+        <w:t xml:space="preserve"> –</w:t>
       </w:r>
       <w:r>
         <w:rPr>
           <w:lang w:val="en-US"/>
         </w:rPr>
-        <w:t xml:space="preserve"> – Room_Funds =&gt; </w:t>
+        <w:t xml:space="preserve"> Contractors </w:t>
       </w:r>
       <w:r>
         <w:rPr>
           <w:lang w:val="en-US"/>
         </w:rPr>
-        <w:t>M:1</w:t>
-      </w:r>
-    </w:p>
-    <w:p>
-      <w:pPr>
-        <w:pStyle w:val="TMS"/>
-        <w:rPr>
-          <w:lang w:val="en-US"/>
-        </w:rPr>
-      </w:pPr>
-      <w:r>
-        <w:rPr>
-          <w:lang w:val="en-US"/>
-        </w:rPr>
-        <w:t xml:space="preserve">5. Reports – Statuses =&gt; </w:t>
-      </w:r>
-      <w:r>
-        <w:rPr>
-          <w:lang w:val="en-US"/>
-        </w:rPr>
-        <w:t>M:1</w:t>
-      </w:r>
-    </w:p>
-    <w:p>
-      <w:pPr>
-        <w:pStyle w:val="TMS"/>
-        <w:rPr>
-          <w:lang w:val="en-US"/>
-        </w:rPr>
-      </w:pPr>
-      <w:r>
-        <w:rPr>
-          <w:lang w:val="en-US"/>
-        </w:rPr>
-        <w:t>6. Reservations – Room_funds</w:t>
-      </w:r>
-      <w:r>
-        <w:rPr>
-          <w:lang w:val="en-US"/>
-        </w:rPr>
-        <w:tab/>
         <w:t xml:space="preserve">=&gt; </w:t>
       </w:r>
       <w:r>
@@ -3380,7 +3029,163 @@
         <w:rPr>
           <w:lang w:val="en-US"/>
         </w:rPr>
-        <w:t xml:space="preserve">7. Reservations – Clients =&gt; </w:t>
+        <w:t>3.</w:t>
+      </w:r>
+      <w:r>
+        <w:rPr>
+          <w:lang w:val="en-US"/>
+        </w:rPr>
+        <w:t>Routes</w:t>
+      </w:r>
+      <w:r>
+        <w:rPr>
+          <w:lang w:val="en-US"/>
+        </w:rPr>
+        <w:t xml:space="preserve"> –</w:t>
+      </w:r>
+      <w:r>
+        <w:rPr>
+          <w:lang w:val="en-US"/>
+        </w:rPr>
+        <w:t xml:space="preserve"> Statuses </w:t>
+      </w:r>
+      <w:r>
+        <w:rPr>
+          <w:lang w:val="en-US"/>
+        </w:rPr>
+        <w:t xml:space="preserve">=&gt; </w:t>
+      </w:r>
+      <w:r>
+        <w:rPr>
+          <w:lang w:val="en-US"/>
+        </w:rPr>
+        <w:t>M:1</w:t>
+      </w:r>
+    </w:p>
+    <w:p>
+      <w:pPr>
+        <w:pStyle w:val="TMS"/>
+        <w:rPr>
+          <w:lang w:val="en-US"/>
+        </w:rPr>
+      </w:pPr>
+      <w:r>
+        <w:rPr>
+          <w:lang w:val="en-US"/>
+        </w:rPr>
+        <w:t xml:space="preserve">4. </w:t>
+      </w:r>
+      <w:r>
+        <w:rPr>
+          <w:lang w:val="en-US"/>
+        </w:rPr>
+        <w:t>Work_areas</w:t>
+      </w:r>
+      <w:r>
+        <w:rPr>
+          <w:lang w:val="en-US"/>
+        </w:rPr>
+        <w:t xml:space="preserve"> –</w:t>
+      </w:r>
+      <w:r>
+        <w:rPr>
+          <w:lang w:val="en-US"/>
+        </w:rPr>
+        <w:t xml:space="preserve"> Districts </w:t>
+      </w:r>
+      <w:r>
+        <w:rPr>
+          <w:lang w:val="en-US"/>
+        </w:rPr>
+        <w:t xml:space="preserve">=&gt; </w:t>
+      </w:r>
+      <w:r>
+        <w:rPr>
+          <w:lang w:val="en-US"/>
+        </w:rPr>
+        <w:t>M:1</w:t>
+      </w:r>
+    </w:p>
+    <w:p>
+      <w:pPr>
+        <w:pStyle w:val="TMS"/>
+        <w:rPr>
+          <w:lang w:val="en-US"/>
+        </w:rPr>
+      </w:pPr>
+      <w:r>
+        <w:rPr>
+          <w:lang w:val="en-US"/>
+        </w:rPr>
+        <w:t>5.</w:t>
+      </w:r>
+      <w:r>
+        <w:rPr>
+          <w:lang w:val="en-US"/>
+        </w:rPr>
+        <w:t>Work_areas</w:t>
+      </w:r>
+      <w:r>
+        <w:rPr>
+          <w:lang w:val="en-US"/>
+        </w:rPr>
+        <w:t xml:space="preserve"> – </w:t>
+      </w:r>
+      <w:r>
+        <w:rPr>
+          <w:lang w:val="en-US"/>
+        </w:rPr>
+        <w:t>Statuses</w:t>
+      </w:r>
+      <w:r>
+        <w:rPr>
+          <w:lang w:val="en-US"/>
+        </w:rPr>
+        <w:t xml:space="preserve"> =&gt; </w:t>
+      </w:r>
+      <w:r>
+        <w:rPr>
+          <w:lang w:val="en-US"/>
+        </w:rPr>
+        <w:t>M:1</w:t>
+      </w:r>
+    </w:p>
+    <w:p>
+      <w:pPr>
+        <w:pStyle w:val="TMS"/>
+        <w:rPr>
+          <w:lang w:val="en-US"/>
+        </w:rPr>
+      </w:pPr>
+      <w:r>
+        <w:rPr>
+          <w:lang w:val="en-US"/>
+        </w:rPr>
+        <w:t>6.</w:t>
+      </w:r>
+      <w:r>
+        <w:rPr>
+          <w:lang w:val="en-US"/>
+        </w:rPr>
+        <w:t>Work_areas</w:t>
+      </w:r>
+      <w:r>
+        <w:rPr>
+          <w:lang w:val="en-US"/>
+        </w:rPr>
+        <w:t xml:space="preserve"> –</w:t>
+      </w:r>
+      <w:r>
+        <w:rPr>
+          <w:lang w:val="en-US"/>
+        </w:rPr>
+        <w:t xml:space="preserve"> Containers </w:t>
+      </w:r>
+      <w:r>
+        <w:rPr>
+          <w:lang w:val="en-US"/>
+        </w:rPr>
+        <w:t xml:space="preserve">=&gt; </w:t>
       </w:r>
       <w:r>
         <w:rPr>
@@ -3441,7 +3246,6 @@
           <w:sz w:val="28"/>
           <w:szCs w:val="28"/>
         </w:rPr>
-        <w:lastRenderedPageBreak/>
         <w:t>атрибуты на атомарные</w:t>
       </w:r>
     </w:p>
@@ -3527,59 +3331,17 @@
     </w:p>
     <w:p>
       <w:pPr>
-        <w:pStyle w:val="afa"/>
-        <w:spacing w:after="0" w:line="360" w:lineRule="auto"/>
-        <w:jc w:val="both"/>
-        <w:rPr>
-          <w:sz w:val="28"/>
-          <w:szCs w:val="28"/>
-        </w:rPr>
-      </w:pPr>
-      <w:r>
-        <w:rPr>
-          <w:sz w:val="28"/>
-          <w:szCs w:val="28"/>
-        </w:rPr>
-        <w:t>+ исходник</w:t>
-      </w:r>
-      <w:r>
-        <w:rPr>
-          <w:sz w:val="28"/>
-          <w:szCs w:val="28"/>
-        </w:rPr>
-        <w:t xml:space="preserve"> в </w:t>
-      </w:r>
-      <w:r>
-        <w:rPr>
-          <w:sz w:val="28"/>
-          <w:szCs w:val="28"/>
-          <w:lang w:val="en-US"/>
-        </w:rPr>
-        <w:t>pdf</w:t>
-      </w:r>
-      <w:r>
-        <w:rPr>
-          <w:sz w:val="28"/>
-          <w:szCs w:val="28"/>
-        </w:rPr>
-        <w:t>.</w:t>
-      </w:r>
-    </w:p>
-    <w:p>
-      <w:pPr>
         <w:pStyle w:val="TMS"/>
         <w:ind w:firstLine="0"/>
         <w:jc w:val="center"/>
       </w:pPr>
       <w:r>
-        <w:rPr>
-          <w:noProof/>
-        </w:rPr>
+        <w:lastRenderedPageBreak/>
         <w:drawing>
-          <wp:inline distT="0" distB="0" distL="0" distR="0" wp14:anchorId="7BF79493" wp14:editId="53572ADD">
-            <wp:extent cx="5940425" cy="3370580"/>
-            <wp:effectExtent l="19050" t="19050" r="22225" b="20320"/>
-            <wp:docPr id="50120382" name="Рисунок 1"/>
+          <wp:inline distT="0" distB="0" distL="0" distR="0" wp14:anchorId="4CB09506" wp14:editId="71C2595D">
+            <wp:extent cx="5940425" cy="3499485"/>
+            <wp:effectExtent l="19050" t="19050" r="22225" b="24765"/>
+            <wp:docPr id="137623010" name="Рисунок 1"/>
             <wp:cNvGraphicFramePr>
               <a:graphicFrameLocks xmlns:a="http://schemas.openxmlformats.org/drawingml/2006/main" noChangeAspect="1"/>
             </wp:cNvGraphicFramePr>
@@ -3587,7 +3349,7 @@
               <a:graphicData uri="http://schemas.openxmlformats.org/drawingml/2006/picture">
                 <pic:pic xmlns:pic="http://schemas.openxmlformats.org/drawingml/2006/picture">
                   <pic:nvPicPr>
-                    <pic:cNvPr id="50120382" name=""/>
+                    <pic:cNvPr id="137623010" name=""/>
                     <pic:cNvPicPr/>
                   </pic:nvPicPr>
                   <pic:blipFill>
@@ -3599,7 +3361,7 @@
                   <pic:spPr>
                     <a:xfrm>
                       <a:off x="0" y="0"/>
-                      <a:ext cx="5940425" cy="3370580"/>
+                      <a:ext cx="5940425" cy="3499485"/>
                     </a:xfrm>
                     <a:prstGeom prst="rect">
                       <a:avLst/>
@@ -4411,7 +4173,6 @@
   <w:style w:type="character" w:default="1" w:styleId="a0">
     <w:name w:val="Default Paragraph Font"/>
     <w:uiPriority w:val="1"/>
-    <w:semiHidden/>
     <w:unhideWhenUsed/>
   </w:style>
   <w:style w:type="table" w:default="1" w:styleId="a1">

</xml_diff>